<commit_message>
Finalize mobile PWA triage MVP
</commit_message>
<xml_diff>
--- a/docs/deliverables/ITPM_Final_Report_Emergency_Triage.docx
+++ b/docs/deliverables/ITPM_Final_Report_Emergency_Triage.docx
@@ -569,6 +569,34 @@
           <w:rFonts w:ascii="IRANSans(FaNum)" w:hAnsi="IRANSans(FaNum)" w:eastAsia="IRANSans(FaNum)" w:cs="IRANSans(FaNum)"/>
           <w:sz w:val="20"/>
         </w:rPr>
+        <w:t>نسخه PWA قابل نصب روی موبایل با manifest، service worker و app shell آفلاین</w:t>
+      </w:r>
+    </w:p>
+    <w:p>
+      <w:pPr>
+        <w:pStyle w:val="ListBullet"/>
+        <w:jc w:val="right"/>
+        <w:bidi/>
+      </w:pPr>
+      <w:r>
+        <w:rPr>
+          <w:rFonts w:ascii="IRANSans(FaNum)" w:hAnsi="IRANSans(FaNum)" w:eastAsia="IRANSans(FaNum)" w:cs="IRANSans(FaNum)"/>
+          <w:sz w:val="20"/>
+        </w:rPr>
+        <w:t>لایه safety-first hybrid برای تشخیص red flagهای حیاتی حتی در ورودی کم‌داده</w:t>
+      </w:r>
+    </w:p>
+    <w:p>
+      <w:pPr>
+        <w:pStyle w:val="ListBullet"/>
+        <w:jc w:val="right"/>
+        <w:bidi/>
+      </w:pPr>
+      <w:r>
+        <w:rPr>
+          <w:rFonts w:ascii="IRANSans(FaNum)" w:hAnsi="IRANSans(FaNum)" w:eastAsia="IRANSans(FaNum)" w:cs="IRANSans(FaNum)"/>
+          <w:sz w:val="20"/>
+        </w:rPr>
         <w:t>پشتیبانی از ورودی ناقص همراه با data completeness و missing fields</w:t>
       </w:r>
     </w:p>
@@ -586,6 +614,337 @@
         <w:t>مستندات کامل مدیریت پروژه، AI usage، Model Card و گزارش نهایی</w:t>
       </w:r>
     </w:p>
+    <w:p>
+      <w:pPr>
+        <w:pStyle w:val="Heading1"/>
+        <w:jc w:val="right"/>
+        <w:bidi/>
+      </w:pPr>
+      <w:r>
+        <w:t>نسخه موبایل و PWA</w:t>
+      </w:r>
+    </w:p>
+    <w:p>
+      <w:pPr>
+        <w:pStyle w:val="ListBullet"/>
+        <w:jc w:val="right"/>
+        <w:bidi/>
+      </w:pPr>
+      <w:r>
+        <w:rPr>
+          <w:rFonts w:ascii="IRANSans(FaNum)" w:hAnsi="IRANSans(FaNum)" w:eastAsia="IRANSans(FaNum)" w:cs="IRANSans(FaNum)"/>
+          <w:sz w:val="20"/>
+        </w:rPr>
+        <w:t>UI برای صفحه کوچک بازطراحی شد: action bar پایین صفحه، تب‌های ورودی/خروجی/پروژه و پنل نتیجه قابل اسکن.</w:t>
+      </w:r>
+    </w:p>
+    <w:p>
+      <w:pPr>
+        <w:pStyle w:val="ListBullet"/>
+        <w:jc w:val="right"/>
+        <w:bidi/>
+      </w:pPr>
+      <w:r>
+        <w:rPr>
+          <w:rFonts w:ascii="IRANSans(FaNum)" w:hAnsi="IRANSans(FaNum)" w:eastAsia="IRANSans(FaNum)" w:cs="IRANSans(FaNum)"/>
+          <w:sz w:val="20"/>
+        </w:rPr>
+        <w:t>manifest.webmanifest و service worker اضافه شد تا اپ بعد از اولین بارگذاری، app shell را در حالت آفلاین نیز باز کند.</w:t>
+      </w:r>
+    </w:p>
+    <w:p>
+      <w:pPr>
+        <w:pStyle w:val="ListBullet"/>
+        <w:jc w:val="right"/>
+        <w:bidi/>
+      </w:pPr>
+      <w:r>
+        <w:rPr>
+          <w:rFonts w:ascii="IRANSans(FaNum)" w:hAnsi="IRANSans(FaNum)" w:eastAsia="IRANSans(FaNum)" w:cs="IRANSans(FaNum)"/>
+          <w:sz w:val="20"/>
+        </w:rPr>
+        <w:t>سناریوهای demo شامل بحرانی، متوسط، کم‌داده و قلبی شدند تا در ویدئو و ارائه، رفتار سیستم با داده ناقص قابل نمایش باشد.</w:t>
+      </w:r>
+    </w:p>
+    <w:p>
+      <w:pPr>
+        <w:pStyle w:val="ListBullet"/>
+        <w:jc w:val="right"/>
+        <w:bidi/>
+      </w:pPr>
+      <w:r>
+        <w:rPr>
+          <w:rFonts w:ascii="IRANSans(FaNum)" w:hAnsi="IRANSans(FaNum)" w:eastAsia="IRANSans(FaNum)" w:cs="IRANSans(FaNum)"/>
+          <w:sz w:val="20"/>
+        </w:rPr>
+        <w:t>در خود MVP لینک مستقیم به بسته شواهد مدیریت پروژه اضافه شد تا محصول، مستندات و Rubric به هم متصل باشند.</w:t>
+      </w:r>
+    </w:p>
+    <w:p>
+      <w:pPr>
+        <w:pStyle w:val="Heading1"/>
+        <w:jc w:val="right"/>
+        <w:bidi/>
+      </w:pPr>
+      <w:r>
+        <w:t>لایه Safety-first Hybrid</w:t>
+      </w:r>
+    </w:p>
+    <w:tbl>
+      <w:tblPr>
+        <w:tblW w:type="auto" w:w="0"/>
+        <w:jc w:val="center"/>
+        <w:tblLayout w:type="fixed"/>
+        <w:tblLook w:firstColumn="1" w:firstRow="1" w:lastColumn="0" w:lastRow="0" w:noHBand="0" w:noVBand="1" w:val="04A0"/>
+        <w:tblBorders>
+          <w:top w:val="single" w:sz="6" w:space="0" w:color="D9E4E8"/>
+          <w:left w:val="single" w:sz="6" w:space="0" w:color="D9E4E8"/>
+          <w:bottom w:val="single" w:sz="6" w:space="0" w:color="D9E4E8"/>
+          <w:right w:val="single" w:sz="6" w:space="0" w:color="D9E4E8"/>
+          <w:insideH w:val="single" w:sz="6" w:space="0" w:color="D9E4E8"/>
+          <w:insideV w:val="single" w:sz="6" w:space="0" w:color="D9E4E8"/>
+        </w:tblBorders>
+      </w:tblPr>
+      <w:tblGrid>
+        <w:gridCol w:w="5100"/>
+        <w:gridCol w:w="5100"/>
+      </w:tblGrid>
+      <w:tr>
+        <w:tc>
+          <w:tcPr>
+            <w:tcW w:type="dxa" w:w="2835"/>
+            <w:shd w:fill="087F8C"/>
+            <w:vAlign w:val="center"/>
+          </w:tcPr>
+          <w:p>
+            <w:pPr>
+              <w:jc w:val="center"/>
+            </w:pPr>
+            <w:r/>
+            <w:r>
+              <w:rPr>
+                <w:rFonts w:ascii="IRANSans(FaNum)" w:hAnsi="IRANSans(FaNum)" w:eastAsia="IRANSans(FaNum)" w:cs="IRANSans(FaNum)"/>
+                <w:b/>
+                <w:color w:val="FFFFFF"/>
+                <w:sz w:val="19"/>
+              </w:rPr>
+              <w:t>مولفه خروجی</w:t>
+            </w:r>
+          </w:p>
+        </w:tc>
+        <w:tc>
+          <w:tcPr>
+            <w:tcW w:type="dxa" w:w="5953"/>
+            <w:shd w:fill="087F8C"/>
+            <w:vAlign w:val="center"/>
+          </w:tcPr>
+          <w:p>
+            <w:pPr>
+              <w:jc w:val="center"/>
+            </w:pPr>
+            <w:r/>
+            <w:r>
+              <w:rPr>
+                <w:rFonts w:ascii="IRANSans(FaNum)" w:hAnsi="IRANSans(FaNum)" w:eastAsia="IRANSans(FaNum)" w:cs="IRANSans(FaNum)"/>
+                <w:b/>
+                <w:color w:val="FFFFFF"/>
+                <w:sz w:val="19"/>
+              </w:rPr>
+              <w:t>توضیح مدیریتی/فنی</w:t>
+            </w:r>
+          </w:p>
+        </w:tc>
+      </w:tr>
+      <w:tr>
+        <w:tc>
+          <w:tcPr>
+            <w:tcW w:type="dxa" w:w="2835"/>
+            <w:vAlign w:val="center"/>
+            <w:shd w:fill="FBFCFD"/>
+          </w:tcPr>
+          <w:p>
+            <w:pPr>
+              <w:jc w:val="right"/>
+              <w:bidi/>
+            </w:pPr>
+            <w:r/>
+            <w:r>
+              <w:rPr>
+                <w:rFonts w:ascii="IRANSans(FaNum)" w:hAnsi="IRANSans(FaNum)" w:eastAsia="IRANSans(FaNum)" w:cs="IRANSans(FaNum)"/>
+                <w:b w:val="0"/>
+                <w:color w:val="17212B"/>
+                <w:sz w:val="17"/>
+              </w:rPr>
+              <w:t>model_probability</w:t>
+            </w:r>
+          </w:p>
+        </w:tc>
+        <w:tc>
+          <w:tcPr>
+            <w:tcW w:type="dxa" w:w="5953"/>
+            <w:vAlign w:val="center"/>
+            <w:shd w:fill="FBFCFD"/>
+          </w:tcPr>
+          <w:p>
+            <w:pPr>
+              <w:jc w:val="right"/>
+              <w:bidi/>
+            </w:pPr>
+            <w:r/>
+            <w:r>
+              <w:rPr>
+                <w:rFonts w:ascii="IRANSans(FaNum)" w:hAnsi="IRANSans(FaNum)" w:eastAsia="IRANSans(FaNum)" w:cs="IRANSans(FaNum)"/>
+                <w:b w:val="0"/>
+                <w:color w:val="17212B"/>
+                <w:sz w:val="17"/>
+              </w:rPr>
+              <w:t>احتمال خام مدل v6 بدون دستکاری</w:t>
+            </w:r>
+          </w:p>
+        </w:tc>
+      </w:tr>
+      <w:tr>
+        <w:tc>
+          <w:tcPr>
+            <w:tcW w:type="dxa" w:w="2835"/>
+            <w:vAlign w:val="center"/>
+          </w:tcPr>
+          <w:p>
+            <w:pPr>
+              <w:jc w:val="right"/>
+              <w:bidi/>
+            </w:pPr>
+            <w:r/>
+            <w:r>
+              <w:rPr>
+                <w:rFonts w:ascii="IRANSans(FaNum)" w:hAnsi="IRANSans(FaNum)" w:eastAsia="IRANSans(FaNum)" w:cs="IRANSans(FaNum)"/>
+                <w:b w:val="0"/>
+                <w:color w:val="17212B"/>
+                <w:sz w:val="17"/>
+              </w:rPr>
+              <w:t>critical_probability</w:t>
+            </w:r>
+          </w:p>
+        </w:tc>
+        <w:tc>
+          <w:tcPr>
+            <w:tcW w:type="dxa" w:w="5953"/>
+            <w:vAlign w:val="center"/>
+          </w:tcPr>
+          <w:p>
+            <w:pPr>
+              <w:jc w:val="right"/>
+              <w:bidi/>
+            </w:pPr>
+            <w:r/>
+            <w:r>
+              <w:rPr>
+                <w:rFonts w:ascii="IRANSans(FaNum)" w:hAnsi="IRANSans(FaNum)" w:eastAsia="IRANSans(FaNum)" w:cs="IRANSans(FaNum)"/>
+                <w:b w:val="0"/>
+                <w:color w:val="17212B"/>
+                <w:sz w:val="17"/>
+              </w:rPr>
+              <w:t>احتمال عملیاتی پس از اعمال guardهای ایمنی شفاف</w:t>
+            </w:r>
+          </w:p>
+        </w:tc>
+      </w:tr>
+      <w:tr>
+        <w:tc>
+          <w:tcPr>
+            <w:tcW w:type="dxa" w:w="2835"/>
+            <w:vAlign w:val="center"/>
+            <w:shd w:fill="FBFCFD"/>
+          </w:tcPr>
+          <w:p>
+            <w:pPr>
+              <w:jc w:val="right"/>
+              <w:bidi/>
+            </w:pPr>
+            <w:r/>
+            <w:r>
+              <w:rPr>
+                <w:rFonts w:ascii="IRANSans(FaNum)" w:hAnsi="IRANSans(FaNum)" w:eastAsia="IRANSans(FaNum)" w:cs="IRANSans(FaNum)"/>
+                <w:b w:val="0"/>
+                <w:color w:val="17212B"/>
+                <w:sz w:val="17"/>
+              </w:rPr>
+              <w:t>safety_flags</w:t>
+            </w:r>
+          </w:p>
+        </w:tc>
+        <w:tc>
+          <w:tcPr>
+            <w:tcW w:type="dxa" w:w="5953"/>
+            <w:vAlign w:val="center"/>
+            <w:shd w:fill="FBFCFD"/>
+          </w:tcPr>
+          <w:p>
+            <w:pPr>
+              <w:jc w:val="right"/>
+              <w:bidi/>
+            </w:pPr>
+            <w:r/>
+            <w:r>
+              <w:rPr>
+                <w:rFonts w:ascii="IRANSans(FaNum)" w:hAnsi="IRANSans(FaNum)" w:eastAsia="IRANSans(FaNum)" w:cs="IRANSans(FaNum)"/>
+                <w:b w:val="0"/>
+                <w:color w:val="17212B"/>
+                <w:sz w:val="17"/>
+              </w:rPr>
+              <w:t>هشدارهای بالینی ساده مثل SpO2 پایین، فشار بسیار پایین یا درد قفسه سینه با سابقه قلبی</w:t>
+            </w:r>
+          </w:p>
+        </w:tc>
+      </w:tr>
+      <w:tr>
+        <w:tc>
+          <w:tcPr>
+            <w:tcW w:type="dxa" w:w="2835"/>
+            <w:vAlign w:val="center"/>
+          </w:tcPr>
+          <w:p>
+            <w:pPr>
+              <w:jc w:val="right"/>
+              <w:bidi/>
+            </w:pPr>
+            <w:r/>
+            <w:r>
+              <w:rPr>
+                <w:rFonts w:ascii="IRANSans(FaNum)" w:hAnsi="IRANSans(FaNum)" w:eastAsia="IRANSans(FaNum)" w:cs="IRANSans(FaNum)"/>
+                <w:b w:val="0"/>
+                <w:color w:val="17212B"/>
+                <w:sz w:val="17"/>
+              </w:rPr>
+              <w:t>next_best_actions</w:t>
+            </w:r>
+          </w:p>
+        </w:tc>
+        <w:tc>
+          <w:tcPr>
+            <w:tcW w:type="dxa" w:w="5953"/>
+            <w:vAlign w:val="center"/>
+          </w:tcPr>
+          <w:p>
+            <w:pPr>
+              <w:jc w:val="right"/>
+              <w:bidi/>
+            </w:pPr>
+            <w:r/>
+            <w:r>
+              <w:rPr>
+                <w:rFonts w:ascii="IRANSans(FaNum)" w:hAnsi="IRANSans(FaNum)" w:eastAsia="IRANSans(FaNum)" w:cs="IRANSans(FaNum)"/>
+                <w:b w:val="0"/>
+                <w:color w:val="17212B"/>
+                <w:sz w:val="17"/>
+              </w:rPr>
+              <w:t>اقدام بعدی قابل ارائه به پرسنل؛ تصمیم نهایی همچنان انسانی است</w:t>
+            </w:r>
+          </w:p>
+        </w:tc>
+      </w:tr>
+    </w:tbl>
+    <w:p/>
     <w:p>
       <w:pPr>
         <w:pStyle w:val="Heading1"/>
@@ -2659,7 +3018,7 @@
                 <w:color w:val="17212B"/>
                 <w:sz w:val="17"/>
               </w:rPr>
-              <w:t>prototype آفلاین</w:t>
+              <w:t>اعتبارسنجی نسخه PWA و local-first</w:t>
             </w:r>
           </w:p>
         </w:tc>
@@ -2681,7 +3040,7 @@
                 <w:color w:val="17212B"/>
                 <w:sz w:val="17"/>
               </w:rPr>
-              <w:t>PWA یا local prototype</w:t>
+              <w:t>تست میدانی با فرم موبایل و بازخورد متخصص</w:t>
             </w:r>
           </w:p>
         </w:tc>

</xml_diff>

<commit_message>
Prepare v7 web app deployment
</commit_message>
<xml_diff>
--- a/docs/deliverables/ITPM_Final_Report_Emergency_Triage.docx
+++ b/docs/deliverables/ITPM_Final_Report_Emergency_Triage.docx
@@ -527,7 +527,7 @@
           <w:rFonts w:ascii="IRANSans(FaNum)" w:hAnsi="IRANSans(FaNum)" w:eastAsia="IRANSans(FaNum)" w:cs="IRANSans(FaNum)"/>
           <w:sz w:val="20"/>
         </w:rPr>
-        <w:t>مدل ML نسخه v6 با threshold safety-first</w:t>
+        <w:t>مدل ML نسخه v7 با threshold safety-first</w:t>
       </w:r>
     </w:p>
     <w:p>
@@ -798,7 +798,7 @@
                 <w:color w:val="17212B"/>
                 <w:sz w:val="17"/>
               </w:rPr>
-              <w:t>احتمال خام مدل v6 بدون دستکاری</w:t>
+              <w:t>احتمال خام مدل v7 بدون دستکاری</w:t>
             </w:r>
           </w:p>
         </w:tc>
@@ -988,7 +988,7 @@
         <w:bidi/>
       </w:pPr>
       <w:r>
-        <w:t>نتایج مدل v6</w:t>
+        <w:t>نتایج مدل v7</w:t>
       </w:r>
     </w:p>
     <w:tbl>
@@ -1122,7 +1122,7 @@
                 <w:color w:val="17212B"/>
                 <w:sz w:val="17"/>
               </w:rPr>
-              <w:t>0.8947</w:t>
+              <w:t>0.9041</w:t>
             </w:r>
           </w:p>
         </w:tc>
@@ -1191,7 +1191,7 @@
                 <w:color w:val="17212B"/>
                 <w:sz w:val="17"/>
               </w:rPr>
-              <w:t>0.8034</w:t>
+              <w:t>0.8202</w:t>
             </w:r>
           </w:p>
         </w:tc>
@@ -1261,7 +1261,7 @@
                 <w:color w:val="17212B"/>
                 <w:sz w:val="17"/>
               </w:rPr>
-              <w:t>0.9241</w:t>
+              <w:t>0.9246</w:t>
             </w:r>
           </w:p>
         </w:tc>
@@ -1330,7 +1330,7 @@
                 <w:color w:val="17212B"/>
                 <w:sz w:val="17"/>
               </w:rPr>
-              <w:t>0.5269</w:t>
+              <w:t>0.5447</w:t>
             </w:r>
           </w:p>
         </w:tc>
@@ -1352,7 +1352,7 @@
                 <w:color w:val="17212B"/>
                 <w:sz w:val="17"/>
               </w:rPr>
-              <w:t>trade-off حالت safety-first</w:t>
+              <w:t>بهتر از v6</w:t>
             </w:r>
           </w:p>
         </w:tc>
@@ -1400,7 +1400,7 @@
                 <w:color w:val="17212B"/>
                 <w:sz w:val="17"/>
               </w:rPr>
-              <w:t>0.3598</w:t>
+              <w:t>0.3352</w:t>
             </w:r>
           </w:p>
         </w:tc>
@@ -1423,7 +1423,7 @@
                 <w:color w:val="17212B"/>
                 <w:sz w:val="17"/>
               </w:rPr>
-              <w:t>کمتر از نسخه‌های اولیه با FPR حدود 0.487</w:t>
+              <w:t>کمتر از v6 و نسخه‌های اولیه</w:t>
             </w:r>
           </w:p>
         </w:tc>
@@ -1469,7 +1469,7 @@
                 <w:color w:val="17212B"/>
                 <w:sz w:val="17"/>
               </w:rPr>
-              <w:t>0.2962</w:t>
+              <w:t>0.3017</w:t>
             </w:r>
           </w:p>
         </w:tc>
@@ -1514,7 +1514,7 @@
               <a:graphicData uri="http://schemas.openxmlformats.org/drawingml/2006/picture">
                 <pic:pic>
                   <pic:nvPicPr>
-                    <pic:cNvPr id="0" name="confusion_matrix_v6.png"/>
+                    <pic:cNvPr id="0" name="confusion_matrix_v7.png"/>
                     <pic:cNvPicPr/>
                   </pic:nvPicPr>
                   <pic:blipFill>
@@ -1548,7 +1548,7 @@
           <w:color w:val="667781"/>
           <w:sz w:val="17"/>
         </w:rPr>
-        <w:t>Confusion Matrix مدل v6</w:t>
+        <w:t>Confusion Matrix مدل v7</w:t>
       </w:r>
     </w:p>
     <w:p>
@@ -1567,7 +1567,7 @@
               <a:graphicData uri="http://schemas.openxmlformats.org/drawingml/2006/picture">
                 <pic:pic>
                   <pic:nvPicPr>
-                    <pic:cNvPr id="0" name="confidence_distribution_v6.png"/>
+                    <pic:cNvPr id="0" name="confidence_distribution_v7.png"/>
                     <pic:cNvPicPr/>
                   </pic:nvPicPr>
                   <pic:blipFill>
@@ -1975,7 +1975,7 @@
                 <w:color w:val="17212B"/>
                 <w:sz w:val="17"/>
               </w:rPr>
-              <w:t>metrics نهایی و Model Card</w:t>
+              <w:t>metrics و Model Card</w:t>
             </w:r>
           </w:p>
         </w:tc>
@@ -2000,7 +2000,7 @@
                 <w:color w:val="17212B"/>
                 <w:sz w:val="17"/>
               </w:rPr>
-              <w:t>Sprint 4</w:t>
+              <w:t>Sprint 6</w:t>
             </w:r>
           </w:p>
         </w:tc>
@@ -2023,6 +2023,75 @@
                 <w:color w:val="17212B"/>
                 <w:sz w:val="17"/>
               </w:rPr>
+              <w:t>مدل v7 و deploy وب‌اپ</w:t>
+            </w:r>
+          </w:p>
+        </w:tc>
+        <w:tc>
+          <w:tcPr>
+            <w:tcW w:type="dxa" w:w="4252"/>
+            <w:vAlign w:val="center"/>
+            <w:shd w:fill="FBFCFD"/>
+          </w:tcPr>
+          <w:p>
+            <w:pPr>
+              <w:jc w:val="right"/>
+              <w:bidi/>
+            </w:pPr>
+            <w:r/>
+            <w:r>
+              <w:rPr>
+                <w:rFonts w:ascii="IRANSans(FaNum)" w:hAnsi="IRANSans(FaNum)" w:eastAsia="IRANSans(FaNum)" w:cs="IRANSans(FaNum)"/>
+                <w:b w:val="0"/>
+                <w:color w:val="17212B"/>
+                <w:sz w:val="17"/>
+              </w:rPr>
+              <w:t>کاهش FPR، Docker و مسیر موبایل</w:t>
+            </w:r>
+          </w:p>
+        </w:tc>
+      </w:tr>
+      <w:tr>
+        <w:tc>
+          <w:tcPr>
+            <w:tcW w:type="dxa" w:w="1701"/>
+            <w:vAlign w:val="center"/>
+          </w:tcPr>
+          <w:p>
+            <w:pPr>
+              <w:jc w:val="right"/>
+              <w:bidi/>
+            </w:pPr>
+            <w:r/>
+            <w:r>
+              <w:rPr>
+                <w:rFonts w:ascii="IRANSans(FaNum)" w:hAnsi="IRANSans(FaNum)" w:eastAsia="IRANSans(FaNum)" w:cs="IRANSans(FaNum)"/>
+                <w:b w:val="0"/>
+                <w:color w:val="17212B"/>
+                <w:sz w:val="17"/>
+              </w:rPr>
+              <w:t>Sprint 4</w:t>
+            </w:r>
+          </w:p>
+        </w:tc>
+        <w:tc>
+          <w:tcPr>
+            <w:tcW w:type="dxa" w:w="3118"/>
+            <w:vAlign w:val="center"/>
+          </w:tcPr>
+          <w:p>
+            <w:pPr>
+              <w:jc w:val="right"/>
+              <w:bidi/>
+            </w:pPr>
+            <w:r/>
+            <w:r>
+              <w:rPr>
+                <w:rFonts w:ascii="IRANSans(FaNum)" w:hAnsi="IRANSans(FaNum)" w:eastAsia="IRANSans(FaNum)" w:cs="IRANSans(FaNum)"/>
+                <w:b w:val="0"/>
+                <w:color w:val="17212B"/>
+                <w:sz w:val="17"/>
+              </w:rPr>
               <w:t>پوستر و تحویل نهایی</w:t>
             </w:r>
           </w:p>
@@ -2031,7 +2100,6 @@
           <w:tcPr>
             <w:tcW w:type="dxa" w:w="4252"/>
             <w:vAlign w:val="center"/>
-            <w:shd w:fill="FBFCFD"/>
           </w:tcPr>
           <w:p>
             <w:pPr>

</xml_diff>